<commit_message>
Cartes Espion et nouveau cycle pour le deck
</commit_message>
<xml_diff>
--- a/pictures/Score-Track-fr/Piste-de-Scores.docx
+++ b/pictures/Score-Track-fr/Piste-de-Scores.docx
@@ -803,10 +803,10 @@
           <w:noProof/>
         </w:rPr>
         <w:drawing>
-          <wp:inline distT="0" distB="0" distL="0" distR="0" wp14:anchorId="583F8344" wp14:editId="12BA19DA">
-            <wp:extent cx="7927975" cy="5038090"/>
-            <wp:effectExtent l="0" t="0" r="0" b="0"/>
-            <wp:docPr id="533669781" name="Image 1"/>
+          <wp:inline distT="0" distB="0" distL="0" distR="0" wp14:anchorId="5AE4B529" wp14:editId="7B70BCF9">
+            <wp:extent cx="7920990" cy="5039995"/>
+            <wp:effectExtent l="0" t="0" r="3810" b="8255"/>
+            <wp:docPr id="521537449" name="Image 2"/>
             <wp:cNvGraphicFramePr>
               <a:graphicFrameLocks xmlns:a="http://schemas.openxmlformats.org/drawingml/2006/main" noChangeAspect="1"/>
             </wp:cNvGraphicFramePr>
@@ -814,7 +814,7 @@
               <a:graphicData uri="http://schemas.openxmlformats.org/drawingml/2006/picture">
                 <pic:pic xmlns:pic="http://schemas.openxmlformats.org/drawingml/2006/picture">
                   <pic:nvPicPr>
-                    <pic:cNvPr id="0" name="Picture 1"/>
+                    <pic:cNvPr id="0" name="Picture 6"/>
                     <pic:cNvPicPr>
                       <a:picLocks noChangeAspect="1" noChangeArrowheads="1"/>
                     </pic:cNvPicPr>
@@ -835,7 +835,7 @@
                   <pic:spPr bwMode="auto">
                     <a:xfrm>
                       <a:off x="0" y="0"/>
-                      <a:ext cx="7927975" cy="5038090"/>
+                      <a:ext cx="7920990" cy="5039995"/>
                     </a:xfrm>
                     <a:prstGeom prst="rect">
                       <a:avLst/>

</xml_diff>